<commit_message>
update huaweicloud project, submit AI project
</commit_message>
<xml_diff>
--- a/HuaWeiCloud project/华为云实验报告.docx
+++ b/HuaWeiCloud project/华为云实验报告.docx
@@ -804,7 +804,7 @@
     <w:p>
       <w:pPr>
         <w:rPr>
-          <w:rFonts w:ascii="Helvetica" w:hAnsi="Helvetica"/>
+          <w:rFonts w:ascii="Helvetica" w:hAnsi="Helvetica" w:hint="eastAsia"/>
           <w:color w:val="000000"/>
           <w:szCs w:val="21"/>
           <w:shd w:val="clear" w:color="auto" w:fill="FFFFFF"/>
@@ -885,16 +885,6 @@
           <w:shd w:val="clear" w:color="auto" w:fill="FFFFFF"/>
         </w:rPr>
       </w:pPr>
-    </w:p>
-    <w:p>
-      <w:pPr>
-        <w:rPr>
-          <w:rFonts w:ascii="Helvetica" w:hAnsi="Helvetica"/>
-          <w:color w:val="000000"/>
-          <w:szCs w:val="21"/>
-          <w:shd w:val="clear" w:color="auto" w:fill="FFFFFF"/>
-        </w:rPr>
-      </w:pPr>
       <w:r>
         <w:rPr>
           <w:rFonts w:ascii="Helvetica" w:hAnsi="Helvetica"/>
@@ -962,6 +952,11 @@
       </w:hyperlink>
     </w:p>
     <w:p>
+      <w:pPr>
+        <w:rPr>
+          <w:rFonts w:hint="eastAsia"/>
+        </w:rPr>
+      </w:pPr>
       <w:hyperlink r:id="rId9" w:history="1">
         <w:r>
           <w:rPr>
@@ -971,17 +966,6 @@
         </w:r>
       </w:hyperlink>
     </w:p>
-    <w:p/>
-    <w:p>
-      <w:pPr>
-        <w:rPr>
-          <w:rFonts w:ascii="Helvetica" w:hAnsi="Helvetica"/>
-          <w:color w:val="000000"/>
-          <w:szCs w:val="21"/>
-          <w:shd w:val="clear" w:color="auto" w:fill="FFFFFF"/>
-        </w:rPr>
-      </w:pPr>
-    </w:p>
     <w:p>
       <w:pPr>
         <w:pStyle w:val="1"/>
@@ -1015,8 +999,28 @@
         <w:rPr>
           <w:rFonts w:ascii="宋体" w:hAnsi="宋体" w:hint="eastAsia"/>
         </w:rPr>
+        <w:t>（分点阐述实验步骤）</w:t>
+      </w:r>
+    </w:p>
+    <w:p>
+      <w:pPr>
+        <w:pStyle w:val="2"/>
+      </w:pPr>
+      <w:r>
+        <w:rPr>
+          <w:rFonts w:hint="eastAsia"/>
+        </w:rPr>
         <w:lastRenderedPageBreak/>
-        <w:t>（分点阐述实验步骤）</w:t>
+        <w:t>1</w:t>
+      </w:r>
+      <w:r>
+        <w:t xml:space="preserve">. </w:t>
+      </w:r>
+      <w:r>
+        <w:rPr>
+          <w:rFonts w:hint="eastAsia"/>
+        </w:rPr>
+        <w:t>配置服务器</w:t>
       </w:r>
     </w:p>
     <w:p>
@@ -1027,7 +1031,7 @@
         <w:rPr>
           <w:rFonts w:hint="eastAsia"/>
         </w:rPr>
-        <w:t>1</w:t>
+        <w:t>2</w:t>
       </w:r>
       <w:r>
         <w:t xml:space="preserve">. </w:t>
@@ -1036,7 +1040,16 @@
         <w:rPr>
           <w:rFonts w:hint="eastAsia"/>
         </w:rPr>
-        <w:t>配置服务器</w:t>
+        <w:t>用Xshell</w:t>
+      </w:r>
+      <w:r>
+        <w:t xml:space="preserve"> </w:t>
+      </w:r>
+      <w:r>
+        <w:rPr>
+          <w:rFonts w:hint="eastAsia"/>
+        </w:rPr>
+        <w:t>登录服务器</w:t>
       </w:r>
     </w:p>
     <w:p>
@@ -1047,35 +1060,6 @@
         <w:rPr>
           <w:rFonts w:hint="eastAsia"/>
         </w:rPr>
-        <w:t>2</w:t>
-      </w:r>
-      <w:r>
-        <w:t xml:space="preserve">. </w:t>
-      </w:r>
-      <w:r>
-        <w:rPr>
-          <w:rFonts w:hint="eastAsia"/>
-        </w:rPr>
-        <w:t>用Xshell</w:t>
-      </w:r>
-      <w:r>
-        <w:t xml:space="preserve"> </w:t>
-      </w:r>
-      <w:r>
-        <w:rPr>
-          <w:rFonts w:hint="eastAsia"/>
-        </w:rPr>
-        <w:t>登录服务器</w:t>
-      </w:r>
-    </w:p>
-    <w:p>
-      <w:pPr>
-        <w:pStyle w:val="2"/>
-      </w:pPr>
-      <w:r>
-        <w:rPr>
-          <w:rFonts w:hint="eastAsia"/>
-        </w:rPr>
         <w:t>3</w:t>
       </w:r>
       <w:r>
@@ -1086,6 +1070,26 @@
           <w:rFonts w:hint="eastAsia"/>
         </w:rPr>
         <w:t xml:space="preserve"> 替换Ubuntu系统的apt-get源。</w:t>
+      </w:r>
+    </w:p>
+    <w:p>
+      <w:pPr>
+        <w:pStyle w:val="3"/>
+      </w:pPr>
+      <w:r>
+        <w:rPr>
+          <w:rFonts w:hint="eastAsia"/>
+        </w:rPr>
+        <w:t>3</w:t>
+      </w:r>
+      <w:r>
+        <w:t>.1</w:t>
+      </w:r>
+      <w:r>
+        <w:rPr>
+          <w:rFonts w:hint="eastAsia"/>
+        </w:rPr>
+        <w:t>遇到的问题</w:t>
       </w:r>
     </w:p>
     <w:p>
@@ -1241,7 +1245,13 @@
         <w:rPr>
           <w:rFonts w:ascii="宋体" w:hAnsi="宋体" w:hint="eastAsia"/>
         </w:rPr>
-        <w:t xml:space="preserve">这个用户怎么什么权限都没有 </w:t>
+        <w:t>这个用户</w:t>
+      </w:r>
+      <w:r>
+        <w:rPr>
+          <w:rFonts w:ascii="宋体" w:hAnsi="宋体" w:hint="eastAsia"/>
+        </w:rPr>
+        <w:t xml:space="preserve">什么权限都没有 </w:t>
       </w:r>
     </w:p>
     <w:p>
@@ -1250,7 +1260,7 @@
           <w:tab w:val="left" w:pos="2980"/>
         </w:tabs>
         <w:rPr>
-          <w:rFonts w:ascii="宋体" w:hAnsi="宋体"/>
+          <w:rFonts w:ascii="宋体" w:hAnsi="宋体" w:hint="eastAsia"/>
         </w:rPr>
       </w:pPr>
       <w:r>
@@ -1286,6 +1296,50 @@
     </w:p>
     <w:p>
       <w:pPr>
+        <w:pStyle w:val="3"/>
+      </w:pPr>
+      <w:r>
+        <w:rPr>
+          <w:rFonts w:hint="eastAsia"/>
+        </w:rPr>
+        <w:t>3</w:t>
+      </w:r>
+      <w:r>
+        <w:t>.2</w:t>
+      </w:r>
+      <w:r>
+        <w:rPr>
+          <w:rFonts w:hint="eastAsia"/>
+        </w:rPr>
+        <w:t>在</w:t>
+      </w:r>
+      <w:r>
+        <w:rPr>
+          <w:rFonts w:hint="eastAsia"/>
+        </w:rPr>
+        <w:t>root</w:t>
+      </w:r>
+      <w:r>
+        <w:rPr>
+          <w:rFonts w:hint="eastAsia"/>
+        </w:rPr>
+        <w:t>用户下设置</w:t>
+      </w:r>
+      <w:r>
+        <w:rPr>
+          <w:rFonts w:hint="eastAsia"/>
+        </w:rPr>
+        <w:t>python</w:t>
+      </w:r>
+      <w:r>
+        <w:rPr>
+          <w:rFonts w:hint="eastAsia"/>
+        </w:rPr>
+        <w:t>的软链接</w:t>
+      </w:r>
+    </w:p>
+    <w:p>
+      <w:pPr>
         <w:tabs>
           <w:tab w:val="left" w:pos="2980"/>
         </w:tabs>
@@ -1293,53 +1347,6 @@
           <w:rFonts w:ascii="宋体" w:hAnsi="宋体"/>
         </w:rPr>
       </w:pPr>
-    </w:p>
-    <w:p>
-      <w:pPr>
-        <w:pStyle w:val="3"/>
-      </w:pPr>
-      <w:r>
-        <w:rPr>
-          <w:rFonts w:hint="eastAsia"/>
-        </w:rPr>
-        <w:t>在</w:t>
-      </w:r>
-      <w:r>
-        <w:rPr>
-          <w:rFonts w:hint="eastAsia"/>
-        </w:rPr>
-        <w:t>root</w:t>
-      </w:r>
-      <w:r>
-        <w:rPr>
-          <w:rFonts w:hint="eastAsia"/>
-        </w:rPr>
-        <w:t>用户下设置</w:t>
-      </w:r>
-      <w:r>
-        <w:rPr>
-          <w:rFonts w:hint="eastAsia"/>
-        </w:rPr>
-        <w:t>python</w:t>
-      </w:r>
-      <w:r>
-        <w:rPr>
-          <w:rFonts w:hint="eastAsia"/>
-        </w:rPr>
-        <w:t>的软链接</w:t>
-      </w:r>
-    </w:p>
-    <w:p>
-      <w:pPr>
-        <w:tabs>
-          <w:tab w:val="left" w:pos="2980"/>
-        </w:tabs>
-        <w:rPr>
-          <w:rFonts w:ascii="宋体" w:hAnsi="宋体"/>
-        </w:rPr>
-      </w:pPr>
-      <w:bookmarkStart w:id="0" w:name="_GoBack"/>
-      <w:bookmarkEnd w:id="0"/>
       <w:r>
         <w:rPr>
           <w:rFonts w:ascii="宋体" w:hAnsi="宋体" w:hint="eastAsia"/>
@@ -2913,6 +2920,15 @@
         <w:rPr>
           <w:rFonts w:hint="eastAsia"/>
         </w:rPr>
+        <w:t>遇到的问题</w:t>
+      </w:r>
+      <w:r>
+        <w:t>:</w:t>
+      </w:r>
+      <w:r>
+        <w:rPr>
+          <w:rFonts w:hint="eastAsia"/>
+        </w:rPr>
         <w:t>硬件驱动</w:t>
       </w:r>
       <w:r>
@@ -2952,7 +2968,16 @@
         <w:t>4</w:t>
       </w:r>
       <w:r>
-        <w:t xml:space="preserve">03 , </w:t>
+        <w:t xml:space="preserve">03 </w:t>
+      </w:r>
+      <w:r>
+        <w:rPr>
+          <w:rFonts w:hint="eastAsia"/>
+        </w:rPr>
+        <w:t>错误</w:t>
+      </w:r>
+      <w:r>
+        <w:t xml:space="preserve">, </w:t>
       </w:r>
       <w:r>
         <w:rPr>
@@ -2964,6 +2989,12 @@
         <w:t>400</w:t>
       </w:r>
       <w:r>
+        <w:rPr>
+          <w:rFonts w:hint="eastAsia"/>
+        </w:rPr>
+        <w:t>错误</w:t>
+      </w:r>
+      <w:r>
         <w:t>.</w:t>
       </w:r>
     </w:p>
@@ -3029,15 +3060,7 @@
         <w:rPr>
           <w:rFonts w:hint="eastAsia"/>
         </w:rPr>
-        <w:t xml:space="preserve"> </w:t>
-      </w:r>
-    </w:p>
-    <w:p>
-      <w:r>
-        <w:rPr>
-          <w:rFonts w:hint="eastAsia"/>
-        </w:rPr>
-        <w:t>root</w:t>
+        <w:t xml:space="preserve"> root</w:t>
       </w:r>
       <w:r>
         <w:rPr>
@@ -3185,13 +3208,22 @@
       </w:r>
       <w:r>
         <w:rPr>
+          <w:rFonts w:ascii="微软雅黑" w:eastAsia="微软雅黑" w:hAnsi="微软雅黑" w:cs="宋体"/>
+          <w:color w:val="000000"/>
+          <w:kern w:val="0"/>
+          <w:sz w:val="18"/>
+          <w:szCs w:val="18"/>
+        </w:rPr>
+        <w:t>,</w:t>
+      </w:r>
+      <w:r>
+        <w:rPr>
           <w:rFonts w:ascii="微软雅黑" w:eastAsia="微软雅黑" w:hAnsi="微软雅黑" w:cs="宋体" w:hint="eastAsia"/>
           <w:color w:val="000000"/>
           <w:kern w:val="0"/>
           <w:sz w:val="18"/>
           <w:szCs w:val="18"/>
         </w:rPr>
-        <w:br/>
         <w:t>具体操作如下</w:t>
       </w:r>
     </w:p>
@@ -3604,6 +3636,7 @@
         <w:t>表示原先设定的路径仍然有效，注意不要漏掉。</w:t>
       </w:r>
     </w:p>
+    <w:p/>
     <w:p>
       <w:pPr>
         <w:pStyle w:val="2"/>
@@ -3624,7 +3657,6 @@
         <w:t xml:space="preserve"> 替换pip源</w:t>
       </w:r>
     </w:p>
-    <w:p/>
     <w:p>
       <w:r>
         <w:t>T</w:t>
@@ -3664,11 +3696,6 @@
       </w:r>
     </w:p>
     <w:p>
-      <w:pPr>
-        <w:rPr>
-          <w:rFonts w:hint="eastAsia"/>
-        </w:rPr>
-      </w:pPr>
       <w:r>
         <w:rPr>
           <w:rFonts w:hint="eastAsia"/>
@@ -3707,11 +3734,6 @@
       </w:r>
     </w:p>
     <w:p>
-      <w:pPr>
-        <w:rPr>
-          <w:rFonts w:hint="eastAsia"/>
-        </w:rPr>
-      </w:pPr>
       <w:r>
         <w:rPr>
           <w:rFonts w:hint="eastAsia"/>
@@ -3780,8 +3802,42 @@
       </w:r>
     </w:p>
     <w:p>
-      <w:r>
-        <w:t>: error while loading shared libraries: libpython3.7m.so.1.0: cannot open shared object file: No such file or directory</w:t>
+      <w:pPr>
+        <w:pStyle w:val="3"/>
+      </w:pPr>
+      <w:r>
+        <w:rPr>
+          <w:rFonts w:hint="eastAsia"/>
+        </w:rPr>
+        <w:t>遇到的问题</w:t>
+      </w:r>
+      <w:r>
+        <w:rPr>
+          <w:rFonts w:hint="eastAsia"/>
+        </w:rPr>
+        <w:t>:</w:t>
+      </w:r>
+    </w:p>
+    <w:p>
+      <w:r>
+        <w:rPr>
+          <w:rFonts w:hint="eastAsia"/>
+        </w:rPr>
+        <w:t>1</w:t>
+      </w:r>
+      <w:r>
+        <w:t>.</w:t>
+      </w:r>
+      <w:r>
+        <w:rPr>
+          <w:rFonts w:hint="eastAsia"/>
+        </w:rPr>
+        <w:t>找不到共享库</w:t>
+      </w:r>
+    </w:p>
+    <w:p>
+      <w:r>
+        <w:t>error while loading shared libraries: libpython3.7m.so.1.0: cannot open shared object file: No such file or directory</w:t>
       </w:r>
     </w:p>
     <w:p>
@@ -3797,6 +3853,59 @@
         </w:rPr>
         <w:t>:</w:t>
       </w:r>
+      <w:r>
+        <w:rPr>
+          <w:rFonts w:hint="eastAsia"/>
+        </w:rPr>
+        <w:t>把共享库</w:t>
+      </w:r>
+      <w:r>
+        <w:rPr>
+          <w:rFonts w:hint="eastAsia"/>
+        </w:rPr>
+        <w:t>复制到</w:t>
+      </w:r>
+      <w:r>
+        <w:rPr>
+          <w:rFonts w:hint="eastAsia"/>
+        </w:rPr>
+        <w:t>/</w:t>
+      </w:r>
+      <w:r>
+        <w:rPr>
+          <w:rFonts w:hint="eastAsia"/>
+        </w:rPr>
+        <w:t>usr</w:t>
+      </w:r>
+      <w:r>
+        <w:t>/</w:t>
+      </w:r>
+      <w:r>
+        <w:rPr>
+          <w:rFonts w:hint="eastAsia"/>
+        </w:rPr>
+        <w:t>lib</w:t>
+      </w:r>
+      <w:r>
+        <w:t>/</w:t>
+      </w:r>
+      <w:r>
+        <w:rPr>
+          <w:rFonts w:hint="eastAsia"/>
+        </w:rPr>
+        <w:t>文件夹下</w:t>
+      </w:r>
+      <w:r>
+        <w:rPr>
+          <w:rFonts w:hint="eastAsia"/>
+        </w:rPr>
+        <w:t>.</w:t>
+      </w:r>
+      <w:r>
+        <w:t xml:space="preserve"> </w:t>
+      </w:r>
+    </w:p>
+    <w:p>
       <w:r>
         <w:rPr>
           <w:rFonts w:ascii="DejaVu Sans Mono" w:hAnsi="DejaVu Sans Mono" w:cs="DejaVu Sans Mono"/>
@@ -3818,23 +3927,6 @@
     </w:p>
     <w:p>
       <w:pPr>
-        <w:pStyle w:val="3"/>
-      </w:pPr>
-      <w:r>
-        <w:rPr>
-          <w:rFonts w:hint="eastAsia"/>
-        </w:rPr>
-        <w:t>自己安装</w:t>
-      </w:r>
-      <w:r>
-        <w:rPr>
-          <w:rFonts w:hint="eastAsia"/>
-        </w:rPr>
-        <w:t>jdk</w:t>
-      </w:r>
-    </w:p>
-    <w:p>
-      <w:pPr>
         <w:tabs>
           <w:tab w:val="left" w:pos="2980"/>
         </w:tabs>
@@ -3846,7 +3938,25 @@
         <w:rPr>
           <w:rFonts w:ascii="宋体" w:hAnsi="宋体" w:hint="eastAsia"/>
         </w:rPr>
-        <w:t>提示没有指定java环境变量，主要原因是没有安装jdk，因此进入root用 户，安装jdk：</w:t>
+        <w:t>2</w:t>
+      </w:r>
+      <w:r>
+        <w:rPr>
+          <w:rFonts w:ascii="宋体" w:hAnsi="宋体"/>
+        </w:rPr>
+        <w:t>.</w:t>
+      </w:r>
+      <w:r>
+        <w:rPr>
+          <w:rFonts w:ascii="宋体" w:hAnsi="宋体" w:hint="eastAsia"/>
+        </w:rPr>
+        <w:t>提示没有指定java环境变量，主要原因是没有安装jdk，因此进入root用 户，安装jdk</w:t>
+      </w:r>
+      <w:r>
+        <w:rPr>
+          <w:rFonts w:ascii="宋体" w:hAnsi="宋体"/>
+        </w:rPr>
+        <w:t>,</w:t>
       </w:r>
     </w:p>
     <w:p>
@@ -3862,7 +3972,13 @@
         <w:rPr>
           <w:rFonts w:ascii="宋体" w:hAnsi="宋体" w:hint="eastAsia"/>
         </w:rPr>
-        <w:t>有了,</w:t>
+        <w:t>可以运行midstudio</w:t>
+      </w:r>
+      <w:r>
+        <w:rPr>
+          <w:rFonts w:ascii="宋体" w:hAnsi="宋体" w:hint="eastAsia"/>
+        </w:rPr>
+        <w:t>,</w:t>
       </w:r>
       <w:r>
         <w:rPr>
@@ -3983,10 +4099,97 @@
     </w:p>
     <w:p>
       <w:pPr>
+        <w:pStyle w:val="3"/>
+      </w:pPr>
+      <w:r>
+        <w:rPr>
+          <w:rFonts w:hint="eastAsia"/>
+        </w:rPr>
+        <w:t>遇到的问题</w:t>
+      </w:r>
+      <w:r>
+        <w:rPr>
+          <w:rFonts w:hint="eastAsia"/>
+        </w:rPr>
+        <w:t>1</w:t>
+      </w:r>
+      <w:r>
+        <w:rPr>
+          <w:rFonts w:hint="eastAsia"/>
+        </w:rPr>
+        <w:t>:</w:t>
+      </w:r>
+    </w:p>
+    <w:p>
+      <w:pPr>
         <w:tabs>
           <w:tab w:val="left" w:pos="2980"/>
         </w:tabs>
         <w:rPr>
+          <w:rFonts w:ascii="宋体" w:hAnsi="宋体" w:hint="eastAsia"/>
+        </w:rPr>
+      </w:pPr>
+      <w:r>
+        <w:rPr>
+          <w:rFonts w:ascii="宋体" w:hAnsi="宋体"/>
+        </w:rPr>
+        <w:t xml:space="preserve"> </w:t>
+      </w:r>
+      <w:r>
+        <w:rPr>
+          <w:rFonts w:ascii="宋体" w:hAnsi="宋体" w:hint="eastAsia"/>
+        </w:rPr>
+        <w:t>没有硬件</w:t>
+      </w:r>
+      <w:r>
+        <w:rPr>
+          <w:rFonts w:ascii="宋体" w:hAnsi="宋体" w:hint="eastAsia"/>
+        </w:rPr>
+        <w:t>,</w:t>
+      </w:r>
+      <w:r>
+        <w:rPr>
+          <w:rFonts w:ascii="宋体" w:hAnsi="宋体"/>
+        </w:rPr>
+        <w:t xml:space="preserve"> </w:t>
+      </w:r>
+      <w:r>
+        <w:rPr>
+          <w:rFonts w:ascii="宋体" w:hAnsi="宋体"/>
+        </w:rPr>
+        <w:t>rtDeviceReset:api is NULL!</w:t>
+      </w:r>
+      <w:r>
+        <w:rPr>
+          <w:rFonts w:ascii="宋体" w:hAnsi="宋体" w:hint="eastAsia"/>
+        </w:rPr>
+        <w:t>因为我没有购买</w:t>
+      </w:r>
+      <w:r>
+        <w:rPr>
+          <w:rFonts w:ascii="宋体" w:hAnsi="宋体"/>
+        </w:rPr>
+        <w:t>AI</w:t>
+      </w:r>
+      <w:r>
+        <w:rPr>
+          <w:rFonts w:ascii="宋体" w:hAnsi="宋体" w:hint="eastAsia"/>
+        </w:rPr>
+        <w:t>加速型</w:t>
+      </w:r>
+      <w:r>
+        <w:rPr>
+          <w:rFonts w:ascii="宋体" w:hAnsi="宋体" w:hint="eastAsia"/>
+        </w:rPr>
+        <w:t>服务器</w:t>
+      </w:r>
+    </w:p>
+    <w:p>
+      <w:pPr>
+        <w:tabs>
+          <w:tab w:val="left" w:pos="2980"/>
+        </w:tabs>
+        <w:rPr>
           <w:rFonts w:ascii="宋体" w:hAnsi="宋体"/>
           <w:color w:val="FF0000"/>
         </w:rPr>
@@ -4035,6 +4238,7 @@
         <w:rPr>
           <w:rFonts w:ascii="宋体" w:hAnsi="宋体"/>
         </w:rPr>
+        <w:lastRenderedPageBreak/>
         <w:t>[ERROR] RUNTIME(5109,main):2021-06-15-21:47:01.293.641 [api_c.cc:297]5109 Instance:Runtime::Instance == nullptr</w:t>
       </w:r>
     </w:p>
@@ -4083,14 +4287,7 @@
         <w:rPr>
           <w:rFonts w:ascii="宋体" w:hAnsi="宋体"/>
         </w:rPr>
-        <w:t xml:space="preserve">[ERROR] ASCENDCL(5109,main):2021-06-15-21:47:01.293.726 [device.cpp:113]5109 </w:t>
-      </w:r>
-      <w:r>
-        <w:rPr>
-          <w:rFonts w:ascii="宋体" w:hAnsi="宋体"/>
-        </w:rPr>
-        <w:lastRenderedPageBreak/>
-        <w:t>aclrtResetDevice: reset device 0 failed, runtime result = 507000.</w:t>
+        <w:t>[ERROR] ASCENDCL(5109,main):2021-06-15-21:47:01.293.726 [device.cpp:113]5109 aclrtResetDevice: reset device 0 failed, runtime result = 507000.</w:t>
       </w:r>
     </w:p>
     <w:p>
@@ -4223,15 +4420,6 @@
       <w:r>
         <w:t xml:space="preserve"> </w:t>
       </w:r>
-      <w:r>
-        <w:t>我不知道</w:t>
-      </w:r>
-      <w:r>
-        <w:t>cann-toolkit</w:t>
-      </w:r>
-      <w:r>
-        <w:t>装哪里了</w:t>
-      </w:r>
     </w:p>
     <w:p>
       <w:pPr>
@@ -4285,52 +4473,90 @@
     </w:p>
     <w:p>
       <w:pPr>
+        <w:pStyle w:val="3"/>
+      </w:pPr>
+      <w:r>
+        <w:rPr>
+          <w:rFonts w:hint="eastAsia"/>
+        </w:rPr>
+        <w:t>遇到的问题</w:t>
+      </w:r>
+      <w:r>
+        <w:t>2</w:t>
+      </w:r>
+      <w:r>
+        <w:rPr>
+          <w:rFonts w:hint="eastAsia"/>
+        </w:rPr>
+        <w:t>:</w:t>
+      </w:r>
+    </w:p>
+    <w:p>
+      <w:pPr>
         <w:tabs>
           <w:tab w:val="left" w:pos="2980"/>
         </w:tabs>
         <w:rPr>
-          <w:rFonts w:ascii="宋体" w:hAnsi="宋体"/>
-        </w:rPr>
-      </w:pPr>
-      <w:r>
-        <w:rPr>
-          <w:rFonts w:ascii="宋体" w:hAnsi="宋体" w:hint="eastAsia"/>
-        </w:rPr>
-        <w:t>好像找到了</w:t>
+          <w:rFonts w:ascii="宋体" w:hAnsi="宋体" w:hint="eastAsia"/>
+        </w:rPr>
+      </w:pPr>
+      <w:r>
+        <w:rPr>
+          <w:rFonts w:ascii="宋体" w:hAnsi="宋体"/>
+        </w:rPr>
+        <w:t xml:space="preserve"> </w:t>
+      </w:r>
+      <w:r>
+        <w:rPr>
+          <w:rFonts w:ascii="宋体" w:hAnsi="宋体" w:hint="eastAsia"/>
+        </w:rPr>
+        <w:t>不知道怎么设置环境变量</w:t>
+      </w:r>
+      <w:r>
+        <w:rPr>
+          <w:rFonts w:ascii="宋体" w:hAnsi="宋体" w:hint="eastAsia"/>
+        </w:rPr>
+        <w:t>,</w:t>
+      </w:r>
+      <w:r>
+        <w:t>不知道</w:t>
+      </w:r>
+      <w:r>
+        <w:t>cann-toolkit</w:t>
+      </w:r>
+      <w:r>
+        <w:t>装</w:t>
+      </w:r>
+      <w:r>
+        <w:rPr>
+          <w:rFonts w:hint="eastAsia"/>
+        </w:rPr>
+        <w:t>在</w:t>
+      </w:r>
+      <w:r>
+        <w:t>哪里</w:t>
+      </w:r>
+    </w:p>
+    <w:p>
+      <w:pPr>
+        <w:tabs>
+          <w:tab w:val="left" w:pos="2980"/>
+        </w:tabs>
+        <w:rPr>
+          <w:rFonts w:ascii="宋体" w:hAnsi="宋体"/>
+        </w:rPr>
+      </w:pPr>
+      <w:r>
+        <w:rPr>
+          <w:rFonts w:ascii="宋体" w:hAnsi="宋体" w:hint="eastAsia"/>
+        </w:rPr>
+        <w:t>尝试用</w:t>
       </w:r>
       <w:r>
         <w:rPr>
           <w:rFonts w:ascii="宋体" w:hAnsi="宋体"/>
         </w:rPr>
         <w:t>/home/HwHiAiUser/Ascend/ascend-toolkit/3.3.0.alpha006</w:t>
-      </w:r>
-    </w:p>
-    <w:p>
-      <w:pPr>
-        <w:tabs>
-          <w:tab w:val="left" w:pos="2980"/>
-        </w:tabs>
-        <w:rPr>
-          <w:rFonts w:ascii="宋体" w:hAnsi="宋体"/>
-        </w:rPr>
-      </w:pPr>
-      <w:r>
-        <w:rPr>
-          <w:rFonts w:ascii="宋体" w:hAnsi="宋体"/>
-        </w:rPr>
-        <w:t>P</w:t>
-      </w:r>
-      <w:r>
-        <w:rPr>
-          <w:rFonts w:ascii="宋体" w:hAnsi="宋体" w:hint="eastAsia"/>
-        </w:rPr>
-        <w:t>ath可以分两段写吗</w:t>
-      </w:r>
-      <w:r>
-        <w:rPr>
-          <w:rFonts w:ascii="宋体" w:hAnsi="宋体" w:hint="eastAsia"/>
-        </w:rPr>
-        <w:t>,好像可以的.</w:t>
       </w:r>
     </w:p>
     <w:p>
@@ -4383,8 +4609,16 @@
         </w:rPr>
         <w:t>所有用户的shell都有权使用这些环境变量</w:t>
       </w:r>
-    </w:p>
-    <w:p>
+      <w:r>
+        <w:rPr>
+          <w:rFonts w:ascii="微软雅黑" w:eastAsia="微软雅黑" w:hAnsi="微软雅黑"/>
+          <w:color w:val="000000"/>
+          <w:sz w:val="18"/>
+          <w:szCs w:val="18"/>
+          <w:shd w:val="clear" w:color="auto" w:fill="FFFFFF"/>
+        </w:rPr>
+        <w:t>,</w:t>
+      </w:r>
       <w:r>
         <w:rPr>
           <w:rFonts w:hint="eastAsia"/>
@@ -4427,6 +4661,12 @@
         <w:t xml:space="preserve"> </w:t>
       </w:r>
       <w:r>
+        <w:rPr>
+          <w:rFonts w:hint="eastAsia"/>
+        </w:rPr>
+        <w:t>编译失败</w:t>
+      </w:r>
+      <w:r>
         <w:t>:</w:t>
       </w:r>
     </w:p>
@@ -4452,6 +4692,7 @@
     </w:p>
     <w:p>
       <w:r>
+        <w:lastRenderedPageBreak/>
         <w:t>make[1]: *** [CMakeFiles/main.dir/all] Error 2</w:t>
       </w:r>
     </w:p>
@@ -4494,7 +4735,6 @@
         <w:rPr>
           <w:noProof/>
         </w:rPr>
-        <w:lastRenderedPageBreak/>
         <w:drawing>
           <wp:inline distT="0" distB="0" distL="0" distR="0" wp14:anchorId="0E028373" wp14:editId="30DC482E">
             <wp:extent cx="5274310" cy="1871980"/>
@@ -4579,13 +4819,59 @@
         <w:rPr>
           <w:rFonts w:ascii="宋体" w:hAnsi="宋体" w:hint="eastAsia"/>
         </w:rPr>
-        <w:t>好奇怪为啥有的自己看有,但是find不到</w:t>
+        <w:t>问题:</w:t>
+      </w:r>
+      <w:r>
+        <w:rPr>
+          <w:rFonts w:ascii="宋体" w:hAnsi="宋体"/>
+        </w:rPr>
+        <w:t xml:space="preserve"> </w:t>
+      </w:r>
+      <w:r>
+        <w:rPr>
+          <w:rFonts w:ascii="宋体" w:hAnsi="宋体" w:hint="eastAsia"/>
+        </w:rPr>
+        <w:t>为啥有的</w:t>
+      </w:r>
+      <w:r>
+        <w:rPr>
+          <w:rFonts w:ascii="宋体" w:hAnsi="宋体" w:hint="eastAsia"/>
+        </w:rPr>
+        <w:t>文件</w:t>
+      </w:r>
+      <w:r>
+        <w:rPr>
+          <w:rFonts w:ascii="宋体" w:hAnsi="宋体" w:hint="eastAsia"/>
+        </w:rPr>
+        <w:t>自己看有,但是find不到</w:t>
       </w:r>
       <w:r>
         <w:rPr>
           <w:rFonts w:ascii="宋体" w:hAnsi="宋体" w:hint="eastAsia"/>
         </w:rPr>
         <w:t>.</w:t>
+      </w:r>
+    </w:p>
+    <w:p>
+      <w:pPr>
+        <w:tabs>
+          <w:tab w:val="left" w:pos="2980"/>
+        </w:tabs>
+        <w:rPr>
+          <w:rFonts w:ascii="宋体" w:hAnsi="宋体"/>
+        </w:rPr>
+      </w:pPr>
+      <w:r>
+        <w:rPr>
+          <w:rFonts w:ascii="宋体" w:hAnsi="宋体" w:hint="eastAsia"/>
+        </w:rPr>
+        <w:t>原因:</w:t>
+      </w:r>
+      <w:r>
+        <w:rPr>
+          <w:rFonts w:ascii="宋体" w:hAnsi="宋体"/>
+        </w:rPr>
+        <w:t xml:space="preserve"> </w:t>
       </w:r>
       <w:r>
         <w:rPr>
@@ -4797,6 +5083,26 @@
     </w:p>
     <w:p>
       <w:pPr>
+        <w:pStyle w:val="3"/>
+      </w:pPr>
+      <w:r>
+        <w:rPr>
+          <w:rFonts w:hint="eastAsia"/>
+        </w:rPr>
+        <w:t>遇到的问题</w:t>
+      </w:r>
+      <w:r>
+        <w:t>3</w:t>
+      </w:r>
+      <w:r>
+        <w:rPr>
+          <w:rFonts w:hint="eastAsia"/>
+        </w:rPr>
+        <w:t>:</w:t>
+      </w:r>
+    </w:p>
+    <w:p>
+      <w:pPr>
         <w:tabs>
           <w:tab w:val="left" w:pos="2980"/>
         </w:tabs>
@@ -5258,6 +5564,7 @@
           <w:sz w:val="20"/>
           <w:szCs w:val="20"/>
         </w:rPr>
+        <w:lastRenderedPageBreak/>
         <w:t>ATC run failed, Please check the detail log, Try 'atc --help' for more information</w:t>
       </w:r>
     </w:p>
@@ -5436,7 +5743,6 @@
         <w:pStyle w:val="2"/>
       </w:pPr>
       <w:r>
-        <w:lastRenderedPageBreak/>
         <w:t>8.</w:t>
       </w:r>
       <w:r>
@@ -5468,7 +5774,7 @@
           <w:tab w:val="left" w:pos="2980"/>
         </w:tabs>
         <w:rPr>
-          <w:rFonts w:ascii="宋体" w:hAnsi="宋体"/>
+          <w:rFonts w:ascii="宋体" w:hAnsi="宋体" w:hint="eastAsia"/>
         </w:rPr>
       </w:pPr>
       <w:r>
@@ -5500,6 +5806,30 @@
           <w:rFonts w:ascii="宋体" w:hAnsi="宋体" w:hint="eastAsia"/>
         </w:rPr>
         <w:t>的环境</w:t>
+      </w:r>
+      <w:r>
+        <w:rPr>
+          <w:rFonts w:ascii="宋体" w:hAnsi="宋体" w:hint="eastAsia"/>
+        </w:rPr>
+        <w:t>,</w:t>
+      </w:r>
+      <w:r>
+        <w:rPr>
+          <w:rFonts w:ascii="宋体" w:hAnsi="宋体"/>
+        </w:rPr>
+        <w:t xml:space="preserve"> </w:t>
+      </w:r>
+      <w:r>
+        <w:rPr>
+          <w:rFonts w:ascii="宋体" w:hAnsi="宋体" w:hint="eastAsia"/>
+        </w:rPr>
+        <w:t>可以参考下面这个文档.</w:t>
+      </w:r>
+      <w:r>
+        <w:rPr>
+          <w:rFonts w:ascii="宋体" w:hAnsi="宋体"/>
+        </w:rPr>
+        <w:t xml:space="preserve"> </w:t>
       </w:r>
     </w:p>
     <w:p>
@@ -5536,6 +5866,68 @@
         </w:rPr>
         <w:t>需要配置</w:t>
       </w:r>
+      <w:r>
+        <w:rPr>
+          <w:rFonts w:ascii="宋体" w:hAnsi="宋体" w:hint="eastAsia"/>
+        </w:rPr>
+        <w:t>,</w:t>
+      </w:r>
+      <w:r>
+        <w:rPr>
+          <w:rFonts w:ascii="宋体" w:hAnsi="宋体" w:hint="eastAsia"/>
+        </w:rPr>
+        <w:t>不知道是不是对的,</w:t>
+      </w:r>
+      <w:r>
+        <w:rPr>
+          <w:rFonts w:ascii="宋体" w:hAnsi="宋体"/>
+        </w:rPr>
+        <w:t xml:space="preserve"> </w:t>
+      </w:r>
+      <w:r>
+        <w:rPr>
+          <w:rFonts w:ascii="宋体" w:hAnsi="宋体" w:hint="eastAsia"/>
+        </w:rPr>
+        <w:t>因为他说python</w:t>
+      </w:r>
+      <w:r>
+        <w:rPr>
+          <w:rFonts w:ascii="宋体" w:hAnsi="宋体"/>
+        </w:rPr>
+        <w:t>3.6,</w:t>
+      </w:r>
+      <w:r>
+        <w:rPr>
+          <w:rFonts w:ascii="宋体" w:hAnsi="宋体" w:hint="eastAsia"/>
+        </w:rPr>
+        <w:t>而我是3</w:t>
+      </w:r>
+      <w:r>
+        <w:rPr>
+          <w:rFonts w:ascii="宋体" w:hAnsi="宋体"/>
+        </w:rPr>
+        <w:t>.7</w:t>
+      </w:r>
+    </w:p>
+    <w:p>
+      <w:pPr>
+        <w:pStyle w:val="3"/>
+        <w:rPr>
+          <w:rFonts w:hint="eastAsia"/>
+        </w:rPr>
+      </w:pPr>
+      <w:r>
+        <w:rPr>
+          <w:rFonts w:hint="eastAsia"/>
+        </w:rPr>
+        <w:t>遇到的问题</w:t>
+      </w:r>
+      <w:r>
+        <w:rPr>
+          <w:rFonts w:hint="eastAsia"/>
+        </w:rPr>
+        <w:t>1:</w:t>
+      </w:r>
     </w:p>
     <w:p>
       <w:pPr>
@@ -5543,44 +5935,14 @@
           <w:tab w:val="left" w:pos="2980"/>
         </w:tabs>
         <w:rPr>
-          <w:rFonts w:ascii="宋体" w:hAnsi="宋体"/>
-        </w:rPr>
-      </w:pPr>
-      <w:r>
-        <w:rPr>
-          <w:rFonts w:ascii="宋体" w:hAnsi="宋体" w:hint="eastAsia"/>
-        </w:rPr>
-        <w:t>不知道是不是对的,</w:t>
-      </w:r>
-      <w:r>
-        <w:rPr>
-          <w:rFonts w:ascii="宋体" w:hAnsi="宋体"/>
-        </w:rPr>
-        <w:t xml:space="preserve"> </w:t>
-      </w:r>
-      <w:r>
-        <w:rPr>
-          <w:rFonts w:ascii="宋体" w:hAnsi="宋体" w:hint="eastAsia"/>
-        </w:rPr>
-        <w:t>因为他说python</w:t>
-      </w:r>
-      <w:r>
-        <w:rPr>
-          <w:rFonts w:ascii="宋体" w:hAnsi="宋体"/>
-        </w:rPr>
-        <w:t>3.6,</w:t>
-      </w:r>
-      <w:r>
-        <w:rPr>
-          <w:rFonts w:ascii="宋体" w:hAnsi="宋体" w:hint="eastAsia"/>
-        </w:rPr>
-        <w:t>而我是3</w:t>
-      </w:r>
-      <w:r>
-        <w:rPr>
-          <w:rFonts w:ascii="宋体" w:hAnsi="宋体"/>
-        </w:rPr>
-        <w:t>.7</w:t>
+          <w:rFonts w:ascii="宋体" w:hAnsi="宋体" w:hint="eastAsia"/>
+        </w:rPr>
+      </w:pPr>
+      <w:r>
+        <w:rPr>
+          <w:rFonts w:ascii="宋体" w:hAnsi="宋体"/>
+        </w:rPr>
+        <w:t>ModuleNotFoundError: No module named 'cv2'</w:t>
       </w:r>
     </w:p>
     <w:p>
@@ -5594,25 +5956,21 @@
       </w:pPr>
       <w:r>
         <w:rPr>
-          <w:rFonts w:ascii="宋体" w:hAnsi="宋体"/>
-        </w:rPr>
-        <w:t>ModuleNotFoundError: No module named 'cv2'</w:t>
-      </w:r>
-    </w:p>
-    <w:p>
-      <w:pPr>
-        <w:tabs>
-          <w:tab w:val="left" w:pos="2980"/>
-        </w:tabs>
-        <w:rPr>
-          <w:rFonts w:ascii="宋体" w:hAnsi="宋体"/>
-        </w:rPr>
-      </w:pPr>
-      <w:r>
-        <w:rPr>
-          <w:rFonts w:ascii="宋体" w:hAnsi="宋体" w:hint="eastAsia"/>
-        </w:rPr>
-        <w:t>怎么知道root把opencv装再哪里</w:t>
+          <w:rFonts w:ascii="宋体" w:hAnsi="宋体" w:hint="eastAsia"/>
+        </w:rPr>
+        <w:t>怎么知道root把opencv</w:t>
+      </w:r>
+      <w:r>
+        <w:rPr>
+          <w:rFonts w:ascii="宋体" w:hAnsi="宋体" w:hint="eastAsia"/>
+        </w:rPr>
+        <w:t>装</w:t>
+      </w:r>
+      <w:r>
+        <w:rPr>
+          <w:rFonts w:ascii="宋体" w:hAnsi="宋体" w:hint="eastAsia"/>
+        </w:rPr>
+        <w:t>哪里</w:t>
       </w:r>
       <w:r>
         <w:rPr>
@@ -5666,6 +6024,54 @@
           <w:rFonts w:ascii="宋体" w:hAnsi="宋体" w:hint="eastAsia"/>
         </w:rPr>
         <w:t>可以把位置放在bashrc中</w:t>
+      </w:r>
+    </w:p>
+    <w:p>
+      <w:pPr>
+        <w:pStyle w:val="3"/>
+      </w:pPr>
+      <w:r>
+        <w:rPr>
+          <w:rFonts w:hint="eastAsia"/>
+        </w:rPr>
+        <w:t>遇到的问题</w:t>
+      </w:r>
+      <w:r>
+        <w:t>2</w:t>
+      </w:r>
+      <w:r>
+        <w:rPr>
+          <w:rFonts w:hint="eastAsia"/>
+        </w:rPr>
+        <w:t>:</w:t>
+      </w:r>
+    </w:p>
+    <w:p>
+      <w:pPr>
+        <w:tabs>
+          <w:tab w:val="left" w:pos="2980"/>
+        </w:tabs>
+        <w:rPr>
+          <w:rFonts w:ascii="宋体" w:hAnsi="宋体" w:hint="eastAsia"/>
+        </w:rPr>
+      </w:pPr>
+      <w:r>
+        <w:rPr>
+          <w:rFonts w:ascii="宋体" w:hAnsi="宋体" w:hint="eastAsia"/>
+        </w:rPr>
+        <w:t>安装失败,</w:t>
+      </w:r>
+      <w:r>
+        <w:rPr>
+          <w:rFonts w:ascii="宋体" w:hAnsi="宋体"/>
+        </w:rPr>
+        <w:t xml:space="preserve"> </w:t>
+      </w:r>
+      <w:r>
+        <w:rPr>
+          <w:rFonts w:ascii="宋体" w:hAnsi="宋体" w:hint="eastAsia"/>
+        </w:rPr>
+        <w:t>缺乏module</w:t>
       </w:r>
     </w:p>
     <w:p>
@@ -5731,6 +6137,12 @@
         <w:rPr>
           <w:rFonts w:ascii="宋体" w:hAnsi="宋体" w:hint="eastAsia"/>
         </w:rPr>
+        <w:t>方法</w:t>
+      </w:r>
+      <w:r>
+        <w:rPr>
+          <w:rFonts w:ascii="宋体" w:hAnsi="宋体" w:hint="eastAsia"/>
+        </w:rPr>
         <w:t xml:space="preserve">一个是可以 </w:t>
       </w:r>
       <w:r>
@@ -5814,7 +6226,7 @@
           <w:tab w:val="left" w:pos="2980"/>
         </w:tabs>
         <w:rPr>
-          <w:rFonts w:ascii="宋体" w:hAnsi="宋体"/>
+          <w:rFonts w:ascii="宋体" w:hAnsi="宋体" w:hint="eastAsia"/>
         </w:rPr>
       </w:pPr>
       <w:r>
@@ -5853,9 +6265,39 @@
       </w:pPr>
       <w:r>
         <w:rPr>
-          <w:rFonts w:ascii="宋体" w:hAnsi="宋体"/>
-        </w:rPr>
-        <w:t>pip -V</w:t>
+          <w:rFonts w:ascii="宋体" w:hAnsi="宋体" w:hint="eastAsia"/>
+        </w:rPr>
+        <w:t>可以用</w:t>
+      </w:r>
+      <w:r>
+        <w:rPr>
+          <w:rFonts w:ascii="宋体" w:hAnsi="宋体"/>
+        </w:rPr>
+        <w:t xml:space="preserve">pip </w:t>
+      </w:r>
+      <w:r>
+        <w:rPr>
+          <w:rFonts w:ascii="宋体" w:hAnsi="宋体"/>
+        </w:rPr>
+        <w:t>–</w:t>
+      </w:r>
+      <w:r>
+        <w:rPr>
+          <w:rFonts w:ascii="宋体" w:hAnsi="宋体"/>
+        </w:rPr>
+        <w:t>V</w:t>
+      </w:r>
+      <w:r>
+        <w:rPr>
+          <w:rFonts w:ascii="宋体" w:hAnsi="宋体"/>
+        </w:rPr>
+        <w:t xml:space="preserve"> </w:t>
+      </w:r>
+      <w:r>
+        <w:rPr>
+          <w:rFonts w:ascii="宋体" w:hAnsi="宋体" w:hint="eastAsia"/>
+        </w:rPr>
+        <w:t>查看版本</w:t>
       </w:r>
     </w:p>
     <w:p>
@@ -5871,94 +6313,46 @@
         <w:rPr>
           <w:rFonts w:ascii="宋体" w:hAnsi="宋体"/>
         </w:rPr>
-        <w:t>pip 7.1.2 from /usr/local/lib/python2.7/dist-packages/pip-7.1.2-py2.7.egg (python 2.7)</w:t>
-      </w:r>
-    </w:p>
-    <w:p>
-      <w:r>
-        <w:rPr>
-          <w:rFonts w:hint="eastAsia"/>
+        <w:t xml:space="preserve">pip 7.1.2 from /usr/local/lib/python2.7/dist-packages/pip-7.1.2-py2.7.egg </w:t>
+      </w:r>
+      <w:r>
+        <w:rPr>
+          <w:rFonts w:ascii="宋体" w:hAnsi="宋体"/>
+        </w:rPr>
+        <w:lastRenderedPageBreak/>
+        <w:t>(python 2.7)</w:t>
+      </w:r>
+    </w:p>
+    <w:p>
+      <w:pPr>
+        <w:tabs>
+          <w:tab w:val="left" w:pos="2980"/>
+        </w:tabs>
+        <w:rPr>
+          <w:rFonts w:ascii="宋体" w:hAnsi="宋体"/>
+        </w:rPr>
+      </w:pPr>
+      <w:r>
+        <w:rPr>
+          <w:rFonts w:ascii="宋体" w:hAnsi="宋体" w:hint="eastAsia"/>
         </w:rPr>
         <w:t>Building wheel for opencv-python (PEP 517) ... /</w:t>
       </w:r>
     </w:p>
     <w:p>
       <w:pPr>
-        <w:widowControl/>
-        <w:shd w:val="clear" w:color="auto" w:fill="FFFFFF"/>
-        <w:spacing w:after="240"/>
-        <w:jc w:val="left"/>
-        <w:rPr>
-          <w:rFonts w:ascii="Arial" w:hAnsi="Arial" w:cs="Arial"/>
-          <w:color w:val="4D4D4D"/>
-          <w:kern w:val="0"/>
-          <w:sz w:val="24"/>
-        </w:rPr>
-      </w:pPr>
-      <w:r>
-        <w:rPr>
-          <w:rFonts w:ascii="Arial" w:hAnsi="Arial" w:cs="Arial" w:hint="eastAsia"/>
-          <w:color w:val="4D4D4D"/>
-          <w:kern w:val="0"/>
-          <w:sz w:val="24"/>
-        </w:rPr>
-        <w:t>卡住</w:t>
-      </w:r>
-      <w:r>
-        <w:rPr>
-          <w:rFonts w:ascii="Arial" w:hAnsi="Arial" w:cs="Arial"/>
-          <w:color w:val="4D4D4D"/>
-          <w:kern w:val="0"/>
-          <w:sz w:val="24"/>
-        </w:rPr>
-        <w:t>加上版本信</w:t>
-      </w:r>
-      <w:r>
-        <w:rPr>
-          <w:rFonts w:ascii="Arial" w:hAnsi="Arial" w:cs="Arial"/>
-          <w:color w:val="4D4D4D"/>
-          <w:kern w:val="0"/>
-          <w:sz w:val="24"/>
-        </w:rPr>
-        <w:t>，采用低版本的</w:t>
-      </w:r>
-      <w:r>
-        <w:rPr>
-          <w:rFonts w:ascii="Arial" w:hAnsi="Arial" w:cs="Arial"/>
-          <w:color w:val="4D4D4D"/>
-          <w:kern w:val="0"/>
-          <w:sz w:val="24"/>
-        </w:rPr>
-        <w:t>opencv</w:t>
-      </w:r>
-      <w:r>
-        <w:rPr>
-          <w:rFonts w:ascii="Arial" w:hAnsi="Arial" w:cs="Arial"/>
-          <w:color w:val="4D4D4D"/>
-          <w:kern w:val="0"/>
-          <w:sz w:val="24"/>
-        </w:rPr>
-        <w:t>。</w:t>
-      </w:r>
-      <w:r>
-        <w:rPr>
-          <w:rFonts w:ascii="DejaVu Sans Mono" w:hAnsi="DejaVu Sans Mono" w:cs="DejaVu Sans Mono"/>
-          <w:color w:val="383A42"/>
-          <w:kern w:val="0"/>
-          <w:szCs w:val="21"/>
-          <w:shd w:val="clear" w:color="auto" w:fill="FAFAFA"/>
-        </w:rPr>
-        <w:t>pip install opencv-python==</w:t>
-      </w:r>
-      <w:r>
-        <w:rPr>
-          <w:rFonts w:ascii="DejaVu Sans Mono" w:hAnsi="DejaVu Sans Mono" w:cs="DejaVu Sans Mono"/>
-          <w:color w:val="986801"/>
-          <w:kern w:val="0"/>
-          <w:szCs w:val="21"/>
-          <w:shd w:val="clear" w:color="auto" w:fill="FAFAFA"/>
-        </w:rPr>
-        <w:t>3.4.9.31</w:t>
+        <w:tabs>
+          <w:tab w:val="left" w:pos="2980"/>
+        </w:tabs>
+        <w:rPr>
+          <w:rFonts w:ascii="宋体" w:hAnsi="宋体"/>
+        </w:rPr>
+      </w:pPr>
+      <w:r>
+        <w:rPr>
+          <w:rFonts w:ascii="宋体" w:hAnsi="宋体"/>
+        </w:rPr>
+        <w:t>采用低版本的opencv。pip install opencv-python==3.4.9.31</w:t>
       </w:r>
     </w:p>
     <w:p>
@@ -6065,6 +6459,22 @@
           <w:tab w:val="left" w:pos="2980"/>
         </w:tabs>
         <w:rPr>
+          <w:rFonts w:ascii="宋体" w:hAnsi="宋体" w:hint="eastAsia"/>
+        </w:rPr>
+      </w:pPr>
+      <w:r>
+        <w:rPr>
+          <w:rFonts w:ascii="宋体" w:hAnsi="宋体" w:hint="eastAsia"/>
+        </w:rPr>
+        <w:t>因为om文件没有权限</w:t>
+      </w:r>
+    </w:p>
+    <w:p>
+      <w:pPr>
+        <w:tabs>
+          <w:tab w:val="left" w:pos="2980"/>
+        </w:tabs>
+        <w:rPr>
           <w:rFonts w:ascii="宋体" w:hAnsi="宋体"/>
         </w:rPr>
       </w:pPr>
@@ -6073,7 +6483,6 @@
           <w:rFonts w:ascii="宋体" w:hAnsi="宋体"/>
           <w:noProof/>
         </w:rPr>
-        <w:lastRenderedPageBreak/>
         <w:drawing>
           <wp:inline distT="0" distB="0" distL="0" distR="0">
             <wp:extent cx="5274310" cy="1492311"/>
@@ -6129,6 +6538,9 @@
         <w:tabs>
           <w:tab w:val="left" w:pos="2980"/>
         </w:tabs>
+        <w:rPr>
+          <w:rFonts w:hint="eastAsia"/>
+        </w:rPr>
       </w:pPr>
       <w:r>
         <w:t>把</w:t>
@@ -6137,7 +6549,25 @@
         <w:t>om</w:t>
       </w:r>
       <w:r>
-        <w:t>模型权限改掉</w:t>
+        <w:t>模型权限改</w:t>
+      </w:r>
+      <w:r>
+        <w:rPr>
+          <w:rFonts w:hint="eastAsia"/>
+        </w:rPr>
+        <w:t>为</w:t>
+      </w:r>
+      <w:r>
+        <w:rPr>
+          <w:rFonts w:hint="eastAsia"/>
+        </w:rPr>
+        <w:t>7</w:t>
+      </w:r>
+      <w:r>
+        <w:t>77</w:t>
+      </w:r>
+      <w:r>
+        <w:t xml:space="preserve"> </w:t>
       </w:r>
       <w:r>
         <w:rPr>
@@ -6154,6 +6584,26 @@
     </w:p>
     <w:p>
       <w:pPr>
+        <w:pStyle w:val="1"/>
+      </w:pPr>
+      <w:r>
+        <w:rPr>
+          <w:rFonts w:hint="eastAsia"/>
+        </w:rPr>
+        <w:t>4</w:t>
+      </w:r>
+      <w:r>
+        <w:t xml:space="preserve"> </w:t>
+      </w:r>
+      <w:r>
+        <w:rPr>
+          <w:rFonts w:hint="eastAsia"/>
+        </w:rPr>
+        <w:t>bonus</w:t>
+      </w:r>
+    </w:p>
+    <w:p>
+      <w:pPr>
         <w:tabs>
           <w:tab w:val="left" w:pos="2980"/>
         </w:tabs>
@@ -6161,506 +6611,501 @@
           <w:rFonts w:hint="eastAsia"/>
         </w:rPr>
       </w:pPr>
+      <w:r>
+        <w:rPr>
+          <w:rFonts w:hint="eastAsia"/>
+        </w:rPr>
+        <w:t>首先</w:t>
+      </w:r>
+      <w:r>
+        <w:rPr>
+          <w:rFonts w:hint="eastAsia"/>
+        </w:rPr>
+        <w:t>,</w:t>
+      </w:r>
+      <w:r>
+        <w:t xml:space="preserve"> </w:t>
+      </w:r>
+      <w:r>
+        <w:rPr>
+          <w:rFonts w:hint="eastAsia"/>
+        </w:rPr>
+        <w:t>把黑白的图转化为彩色图</w:t>
+      </w:r>
+      <w:r>
+        <w:rPr>
+          <w:rFonts w:hint="eastAsia"/>
+        </w:rPr>
+        <w:t>.</w:t>
+      </w:r>
+      <w:r>
+        <w:t xml:space="preserve">  </w:t>
+      </w:r>
+      <w:r>
+        <w:rPr>
+          <w:rFonts w:hint="eastAsia"/>
+        </w:rPr>
+        <w:t>然后识别</w:t>
+      </w:r>
+      <w:r>
+        <w:rPr>
+          <w:rFonts w:hint="eastAsia"/>
+        </w:rPr>
+        <w:t>.</w:t>
+      </w:r>
+    </w:p>
+    <w:p>
+      <w:pPr>
+        <w:tabs>
+          <w:tab w:val="left" w:pos="2980"/>
+        </w:tabs>
+        <w:rPr>
+          <w:rFonts w:hint="eastAsia"/>
+        </w:rPr>
+      </w:pPr>
+      <w:r>
+        <w:t xml:space="preserve">samples: CANN Samples </w:t>
+      </w:r>
+      <w:r>
+        <w:t>–</w:t>
+      </w:r>
+      <w:r>
+        <w:t xml:space="preserve"> Gitee</w:t>
+      </w:r>
+    </w:p>
+    <w:p>
+      <w:pPr>
+        <w:pStyle w:val="2"/>
+      </w:pPr>
+      <w:r>
+        <w:rPr>
+          <w:rFonts w:hint="eastAsia"/>
+        </w:rPr>
+        <w:t>遇到的问题:</w:t>
+      </w:r>
+    </w:p>
+    <w:p>
+      <w:pPr>
+        <w:tabs>
+          <w:tab w:val="left" w:pos="2980"/>
+        </w:tabs>
+      </w:pPr>
+      <w:r>
+        <w:rPr>
+          <w:rFonts w:hint="eastAsia"/>
+        </w:rPr>
+        <w:t>1</w:t>
+      </w:r>
+      <w:r>
+        <w:t>.</w:t>
+      </w:r>
+      <w:r>
+        <w:rPr>
+          <w:rFonts w:hint="eastAsia"/>
+        </w:rPr>
+        <w:t>没有</w:t>
+      </w:r>
+      <w:r>
+        <w:rPr>
+          <w:rFonts w:hint="eastAsia"/>
+        </w:rPr>
+        <w:t>atc</w:t>
+      </w:r>
+      <w:r>
+        <w:t>,</w:t>
+      </w:r>
+      <w:r>
+        <w:rPr>
+          <w:rFonts w:hint="eastAsia"/>
+        </w:rPr>
+        <w:t>还是环境变量不对</w:t>
+      </w:r>
+      <w:r>
+        <w:t>这个</w:t>
+      </w:r>
+      <w:r>
+        <w:t>是</w:t>
+      </w:r>
+      <w:r>
+        <w:rPr>
+          <w:rFonts w:hint="eastAsia"/>
+        </w:rPr>
+        <w:t>离线推理也就是</w:t>
+      </w:r>
+      <w:r>
+        <w:t>运行环境</w:t>
+      </w:r>
+      <w:r>
+        <w:rPr>
+          <w:rFonts w:hint="eastAsia"/>
+        </w:rPr>
+        <w:t>,</w:t>
+      </w:r>
+    </w:p>
+    <w:p>
+      <w:pPr>
+        <w:tabs>
+          <w:tab w:val="left" w:pos="2980"/>
+        </w:tabs>
+      </w:pPr>
+      <w:r>
+        <w:rPr>
+          <w:rFonts w:hint="eastAsia"/>
+        </w:rPr>
+        <w:t>atc</w:t>
+      </w:r>
+      <w:r>
+        <w:rPr>
+          <w:rFonts w:hint="eastAsia"/>
+        </w:rPr>
+        <w:t>是开发环境</w:t>
+      </w:r>
+      <w:r>
+        <w:rPr>
+          <w:rFonts w:hint="eastAsia"/>
+        </w:rPr>
+        <w:t>,</w:t>
+      </w:r>
+      <w:r>
+        <w:t xml:space="preserve"> </w:t>
+      </w:r>
+      <w:r>
+        <w:rPr>
+          <w:rFonts w:hint="eastAsia"/>
+        </w:rPr>
+        <w:t>也就是</w:t>
+      </w:r>
+      <w:r>
+        <w:t>Model transformation and operator develop</w:t>
+      </w:r>
+      <w:r>
+        <w:rPr>
+          <w:rFonts w:hint="eastAsia"/>
+        </w:rPr>
+        <w:t>这是模型转换的</w:t>
+      </w:r>
+    </w:p>
+    <w:p>
+      <w:pPr>
+        <w:tabs>
+          <w:tab w:val="left" w:pos="2980"/>
+        </w:tabs>
+      </w:pPr>
+      <w:r>
+        <w:t>2</w:t>
+      </w:r>
+      <w:r>
+        <w:t>.</w:t>
+      </w:r>
+      <w:r>
+        <w:rPr>
+          <w:rFonts w:hint="eastAsia"/>
+        </w:rPr>
+        <w:t>path</w:t>
+      </w:r>
+      <w:r>
+        <w:rPr>
+          <w:rFonts w:hint="eastAsia"/>
+        </w:rPr>
+        <w:t>分两行写可以吗</w:t>
+      </w:r>
+      <w:r>
+        <w:rPr>
+          <w:rFonts w:hint="eastAsia"/>
+        </w:rPr>
+        <w:t>?</w:t>
+      </w:r>
+    </w:p>
+    <w:p>
+      <w:pPr>
+        <w:tabs>
+          <w:tab w:val="left" w:pos="2980"/>
+        </w:tabs>
+      </w:pPr>
+      <w:r>
+        <w:rPr>
+          <w:rFonts w:hint="eastAsia"/>
+        </w:rPr>
+        <w:t>可以</w:t>
+      </w:r>
+    </w:p>
+    <w:p>
+      <w:pPr>
+        <w:tabs>
+          <w:tab w:val="left" w:pos="2980"/>
+        </w:tabs>
+      </w:pPr>
+      <w:r>
+        <w:t>3</w:t>
+      </w:r>
+      <w:r>
+        <w:t xml:space="preserve">. </w:t>
+      </w:r>
+      <w:r>
+        <w:t>The env ASCEND_OPP_PATH[/home/HwHiAiUser/Ascend/ascend-toolkit/latest/opp:] is invalid when loading the tiling lib</w:t>
+      </w:r>
+    </w:p>
+    <w:p>
+      <w:pPr>
+        <w:tabs>
+          <w:tab w:val="left" w:pos="2980"/>
+        </w:tabs>
+      </w:pPr>
+      <w:r>
+        <w:rPr>
+          <w:rFonts w:hint="eastAsia"/>
+        </w:rPr>
+        <w:t>因为多了一个冒号</w:t>
+      </w:r>
+      <w:r>
+        <w:rPr>
+          <w:rFonts w:hint="eastAsia"/>
+        </w:rPr>
+        <w:t xml:space="preserve">, </w:t>
+      </w:r>
+      <w:r>
+        <w:rPr>
+          <w:rFonts w:hint="eastAsia"/>
+        </w:rPr>
+        <w:t>最后不用加冒号也不用</w:t>
+      </w:r>
+      <w:r>
+        <w:rPr>
+          <w:rFonts w:hint="eastAsia"/>
+        </w:rPr>
+        <w:t>加</w:t>
+      </w:r>
+      <w:r>
+        <w:rPr>
+          <w:rFonts w:hint="eastAsia"/>
+        </w:rPr>
+        <w:t>$ascendopp</w:t>
+      </w:r>
+    </w:p>
+    <w:p>
+      <w:pPr>
+        <w:tabs>
+          <w:tab w:val="left" w:pos="2980"/>
+        </w:tabs>
+      </w:pPr>
+    </w:p>
+    <w:p>
+      <w:pPr>
+        <w:tabs>
+          <w:tab w:val="left" w:pos="2980"/>
+        </w:tabs>
+      </w:pPr>
+      <w:r>
+        <w:t>4</w:t>
+      </w:r>
+      <w:r>
+        <w:t xml:space="preserve">. </w:t>
+      </w:r>
+      <w:r>
+        <w:t>ModuleNotFoundError: No module named 'PIL'</w:t>
+      </w:r>
+    </w:p>
+    <w:p>
+      <w:pPr>
+        <w:tabs>
+          <w:tab w:val="left" w:pos="2980"/>
+        </w:tabs>
+      </w:pPr>
+      <w:r>
+        <w:rPr>
+          <w:rFonts w:hint="eastAsia"/>
+        </w:rPr>
+        <w:t>不要用</w:t>
+      </w:r>
+      <w:r>
+        <w:rPr>
+          <w:rFonts w:hint="eastAsia"/>
+        </w:rPr>
+        <w:t>python</w:t>
+      </w:r>
+      <w:r>
+        <w:t>3.6</w:t>
+      </w:r>
+      <w:r>
+        <w:t xml:space="preserve">  </w:t>
+      </w:r>
+      <w:r>
+        <w:rPr>
+          <w:rFonts w:hint="eastAsia"/>
+        </w:rPr>
+        <w:t>运行文件</w:t>
+      </w:r>
+    </w:p>
+    <w:p>
+      <w:pPr>
+        <w:tabs>
+          <w:tab w:val="left" w:pos="2980"/>
+        </w:tabs>
+      </w:pPr>
+      <w:r>
+        <w:rPr>
+          <w:rFonts w:hint="eastAsia"/>
+        </w:rPr>
+        <w:t>命令</w:t>
+      </w:r>
+      <w:r>
+        <w:rPr>
+          <w:rFonts w:hint="eastAsia"/>
+        </w:rPr>
+        <w:t xml:space="preserve"> </w:t>
+      </w:r>
+      <w:r>
+        <w:t xml:space="preserve">: </w:t>
+      </w:r>
+      <w:r>
+        <w:t>python3 colorize.py ../data/</w:t>
+      </w:r>
+      <w:r>
+        <w:t xml:space="preserve"> </w:t>
+      </w:r>
+      <w:r>
+        <w:rPr>
+          <w:rFonts w:hint="eastAsia"/>
+        </w:rPr>
+        <w:t>即可</w:t>
+      </w:r>
+    </w:p>
+    <w:p>
+      <w:pPr>
+        <w:tabs>
+          <w:tab w:val="left" w:pos="2980"/>
+        </w:tabs>
+      </w:pPr>
+      <w:r>
+        <w:t>5</w:t>
+      </w:r>
+      <w:r>
+        <w:t xml:space="preserve">. </w:t>
+      </w:r>
+      <w:r>
+        <w:t>AttributeError: 'NoneType' object has no attribute 'width'</w:t>
+      </w:r>
+    </w:p>
+    <w:p>
+      <w:pPr>
+        <w:tabs>
+          <w:tab w:val="left" w:pos="2980"/>
+        </w:tabs>
+        <w:rPr>
+          <w:rFonts w:hint="eastAsia"/>
+        </w:rPr>
+      </w:pPr>
+      <w:r>
+        <w:rPr>
+          <w:rFonts w:hint="eastAsia"/>
+        </w:rPr>
+        <w:lastRenderedPageBreak/>
+        <w:t>好像</w:t>
+      </w:r>
+      <w:r>
+        <w:rPr>
+          <w:rFonts w:hint="eastAsia"/>
+        </w:rPr>
+        <w:t>image</w:t>
+      </w:r>
+      <w:r>
+        <w:rPr>
+          <w:rFonts w:hint="eastAsia"/>
+        </w:rPr>
+        <w:t>没有读进来</w:t>
+      </w:r>
+      <w:r>
+        <w:rPr>
+          <w:rFonts w:hint="eastAsia"/>
+        </w:rPr>
+        <w:t>,</w:t>
+      </w:r>
+      <w:r>
+        <w:rPr>
+          <w:rFonts w:hint="eastAsia"/>
+        </w:rPr>
+        <w:t>把图片改成一样大就可以了</w:t>
+      </w:r>
+      <w:r>
+        <w:rPr>
+          <w:rFonts w:hint="eastAsia"/>
+        </w:rPr>
+        <w:t>.</w:t>
+      </w:r>
     </w:p>
     <w:p>
       <w:pPr>
         <w:pStyle w:val="1"/>
       </w:pPr>
       <w:r>
-        <w:rPr>
-          <w:rFonts w:hint="eastAsia"/>
-        </w:rPr>
-        <w:t>4</w:t>
-      </w:r>
-      <w:r>
-        <w:rPr>
-          <w:rFonts w:hint="eastAsia"/>
-        </w:rPr>
-        <w:t>bonus</w:t>
-      </w:r>
-      <w:r>
-        <w:t>:</w:t>
-      </w:r>
-    </w:p>
-    <w:p>
-      <w:pPr>
-        <w:tabs>
-          <w:tab w:val="left" w:pos="2980"/>
-        </w:tabs>
-      </w:pPr>
-      <w:r>
-        <w:rPr>
-          <w:rFonts w:hint="eastAsia"/>
-        </w:rPr>
-        <w:t>首先</w:t>
-      </w:r>
-      <w:r>
-        <w:rPr>
-          <w:rFonts w:hint="eastAsia"/>
-        </w:rPr>
+        <w:t>5</w:t>
+      </w:r>
+      <w:r>
+        <w:t xml:space="preserve"> </w:t>
+      </w:r>
+      <w:r>
+        <w:t>实验</w:t>
+      </w:r>
+      <w:r>
+        <w:rPr>
+          <w:rFonts w:hint="eastAsia"/>
+        </w:rPr>
+        <w:t>结果和分析</w:t>
+      </w:r>
+    </w:p>
+    <w:p>
+      <w:pPr>
+        <w:rPr>
+          <w:rFonts w:ascii="宋体" w:hAnsi="宋体"/>
+        </w:rPr>
+      </w:pPr>
+      <w:r>
+        <w:rPr>
+          <w:rFonts w:ascii="宋体" w:hAnsi="宋体" w:hint="eastAsia"/>
+        </w:rPr>
+        <w:t>（使用图片和文字叙述实验结果，并对这些结果进行适当分析）</w:t>
+      </w:r>
+    </w:p>
+    <w:p>
+      <w:pPr>
+        <w:pStyle w:val="2"/>
+        <w:rPr>
+          <w:rFonts w:hint="eastAsia"/>
+        </w:rPr>
+      </w:pPr>
+      <w:r>
+        <w:rPr>
+          <w:rFonts w:hint="eastAsia"/>
+        </w:rPr>
+        <w:t>5</w:t>
+      </w:r>
+      <w:r>
+        <w:t>.1</w:t>
+      </w:r>
+      <w:r>
+        <w:rPr>
+          <w:rFonts w:hint="eastAsia"/>
+        </w:rPr>
+        <w:t>运行一个demo</w:t>
+      </w:r>
+      <w:r>
         <w:t>,</w:t>
       </w:r>
       <w:r>
-        <w:t xml:space="preserve"> </w:t>
-      </w:r>
-      <w:r>
-        <w:rPr>
-          <w:rFonts w:hint="eastAsia"/>
-        </w:rPr>
-        <w:t>把黑白的图转化为彩色图</w:t>
-      </w:r>
-      <w:r>
-        <w:rPr>
-          <w:rFonts w:hint="eastAsia"/>
-        </w:rPr>
-        <w:t>.</w:t>
-      </w:r>
-      <w:r>
-        <w:t xml:space="preserve">  </w:t>
-      </w:r>
-      <w:r>
-        <w:rPr>
-          <w:rFonts w:hint="eastAsia"/>
-        </w:rPr>
-        <w:t>然后识别</w:t>
-      </w:r>
-      <w:r>
-        <w:rPr>
-          <w:rFonts w:hint="eastAsia"/>
-        </w:rPr>
-        <w:t>.</w:t>
-      </w:r>
-    </w:p>
-    <w:p>
-      <w:pPr>
-        <w:tabs>
-          <w:tab w:val="left" w:pos="2980"/>
-        </w:tabs>
-      </w:pPr>
-    </w:p>
-    <w:p>
-      <w:pPr>
-        <w:tabs>
-          <w:tab w:val="left" w:pos="2980"/>
-        </w:tabs>
-      </w:pPr>
-      <w:r>
-        <w:t xml:space="preserve">samples: CANN Samples </w:t>
-      </w:r>
-      <w:r>
-        <w:t>–</w:t>
-      </w:r>
-      <w:r>
-        <w:t xml:space="preserve"> Gitee</w:t>
-      </w:r>
-    </w:p>
-    <w:p>
-      <w:pPr>
-        <w:tabs>
-          <w:tab w:val="left" w:pos="2980"/>
-        </w:tabs>
-      </w:pPr>
-    </w:p>
-    <w:p>
-      <w:pPr>
-        <w:tabs>
-          <w:tab w:val="left" w:pos="2980"/>
-        </w:tabs>
-      </w:pPr>
-      <w:r>
-        <w:rPr>
-          <w:rFonts w:hint="eastAsia"/>
-        </w:rPr>
-        <w:t>遇到的问题</w:t>
-      </w:r>
-      <w:r>
-        <w:rPr>
-          <w:rFonts w:hint="eastAsia"/>
-        </w:rPr>
-        <w:t>:</w:t>
-      </w:r>
-    </w:p>
-    <w:p>
-      <w:pPr>
-        <w:tabs>
-          <w:tab w:val="left" w:pos="2980"/>
-        </w:tabs>
-      </w:pPr>
-      <w:r>
-        <w:rPr>
-          <w:rFonts w:hint="eastAsia"/>
-        </w:rPr>
-        <w:t>1</w:t>
-      </w:r>
-      <w:r>
-        <w:t>.</w:t>
-      </w:r>
-      <w:r>
-        <w:rPr>
-          <w:rFonts w:hint="eastAsia"/>
-        </w:rPr>
-        <w:t>没有</w:t>
-      </w:r>
-      <w:r>
-        <w:rPr>
-          <w:rFonts w:hint="eastAsia"/>
-        </w:rPr>
-        <w:t>atc</w:t>
-      </w:r>
-      <w:r>
-        <w:t>,</w:t>
-      </w:r>
-      <w:r>
-        <w:rPr>
-          <w:rFonts w:hint="eastAsia"/>
-        </w:rPr>
-        <w:t>还是环境变量不对</w:t>
-      </w:r>
-      <w:r>
-        <w:t>这个</w:t>
-      </w:r>
-      <w:r>
-        <w:t>是</w:t>
-      </w:r>
-      <w:r>
-        <w:rPr>
-          <w:rFonts w:hint="eastAsia"/>
-        </w:rPr>
-        <w:t>离线推理也就是</w:t>
-      </w:r>
-      <w:r>
-        <w:t>运行环境</w:t>
-      </w:r>
-      <w:r>
-        <w:rPr>
-          <w:rFonts w:hint="eastAsia"/>
-        </w:rPr>
-        <w:t>,</w:t>
-      </w:r>
-      <w:r>
-        <w:t xml:space="preserve"> </w:t>
-      </w:r>
-    </w:p>
-    <w:p>
-      <w:pPr>
-        <w:tabs>
-          <w:tab w:val="left" w:pos="2980"/>
-        </w:tabs>
-      </w:pPr>
-      <w:r>
-        <w:t>2.</w:t>
-      </w:r>
-      <w:r>
-        <w:rPr>
-          <w:rFonts w:hint="eastAsia"/>
-        </w:rPr>
-        <w:t>atc</w:t>
-      </w:r>
-      <w:r>
-        <w:rPr>
-          <w:rFonts w:hint="eastAsia"/>
-        </w:rPr>
-        <w:t>是开发环境</w:t>
-      </w:r>
-      <w:r>
-        <w:rPr>
-          <w:rFonts w:hint="eastAsia"/>
-        </w:rPr>
-        <w:t>,</w:t>
-      </w:r>
-      <w:r>
-        <w:t xml:space="preserve"> </w:t>
-      </w:r>
-      <w:r>
-        <w:rPr>
-          <w:rFonts w:hint="eastAsia"/>
-        </w:rPr>
-        <w:t>也就是</w:t>
-      </w:r>
-      <w:r>
-        <w:t>Model transformation and operator develop</w:t>
-      </w:r>
-      <w:r>
-        <w:rPr>
-          <w:rFonts w:hint="eastAsia"/>
-        </w:rPr>
-        <w:t>这是模型转换的</w:t>
-      </w:r>
-    </w:p>
-    <w:p>
-      <w:pPr>
-        <w:tabs>
-          <w:tab w:val="left" w:pos="2980"/>
-        </w:tabs>
-      </w:pPr>
-      <w:r>
-        <w:t>3.</w:t>
-      </w:r>
-      <w:r>
-        <w:rPr>
-          <w:rFonts w:hint="eastAsia"/>
-        </w:rPr>
-        <w:t>path</w:t>
-      </w:r>
-      <w:r>
-        <w:rPr>
-          <w:rFonts w:hint="eastAsia"/>
-        </w:rPr>
-        <w:t>分两行写可以吗</w:t>
-      </w:r>
-    </w:p>
-    <w:p>
-      <w:pPr>
-        <w:tabs>
-          <w:tab w:val="left" w:pos="2980"/>
-        </w:tabs>
-      </w:pPr>
-      <w:r>
-        <w:rPr>
-          <w:rFonts w:hint="eastAsia"/>
-        </w:rPr>
-        <w:t>可以</w:t>
-      </w:r>
-    </w:p>
-    <w:p>
-      <w:pPr>
-        <w:tabs>
-          <w:tab w:val="left" w:pos="2980"/>
-        </w:tabs>
-      </w:pPr>
-      <w:r>
-        <w:t xml:space="preserve">4. </w:t>
-      </w:r>
-      <w:r>
-        <w:t>The env ASCEND_OPP_PATH[/home/HwHiAiUser/Ascend/ascend-toolkit/latest/opp:] is invalid when loading the tiling lib</w:t>
-      </w:r>
-    </w:p>
-    <w:p>
-      <w:pPr>
-        <w:tabs>
-          <w:tab w:val="left" w:pos="2980"/>
-        </w:tabs>
-      </w:pPr>
-      <w:r>
-        <w:rPr>
-          <w:rFonts w:hint="eastAsia"/>
-        </w:rPr>
-        <w:t>因为多了一个冒号</w:t>
-      </w:r>
-      <w:r>
-        <w:rPr>
-          <w:rFonts w:hint="eastAsia"/>
-        </w:rPr>
-        <w:t xml:space="preserve">, </w:t>
-      </w:r>
-      <w:r>
-        <w:rPr>
-          <w:rFonts w:hint="eastAsia"/>
-        </w:rPr>
-        <w:t>最后不用加冒号也不用</w:t>
-      </w:r>
-      <w:r>
-        <w:rPr>
-          <w:rFonts w:hint="eastAsia"/>
-        </w:rPr>
-        <w:t>加</w:t>
-      </w:r>
-      <w:r>
-        <w:rPr>
-          <w:rFonts w:hint="eastAsia"/>
-        </w:rPr>
-        <w:t>$ascendopp</w:t>
-      </w:r>
-    </w:p>
-    <w:p>
-      <w:pPr>
-        <w:tabs>
-          <w:tab w:val="left" w:pos="2980"/>
-        </w:tabs>
-      </w:pPr>
-    </w:p>
-    <w:p>
-      <w:pPr>
-        <w:tabs>
-          <w:tab w:val="left" w:pos="2980"/>
-        </w:tabs>
-      </w:pPr>
-      <w:r>
-        <w:t xml:space="preserve">5. </w:t>
-      </w:r>
-      <w:r>
-        <w:t>ModuleNotFoundError: No module named 'PIL'</w:t>
-      </w:r>
-    </w:p>
-    <w:p>
-      <w:pPr>
-        <w:tabs>
-          <w:tab w:val="left" w:pos="2980"/>
-        </w:tabs>
-      </w:pPr>
-      <w:r>
-        <w:rPr>
-          <w:rFonts w:hint="eastAsia"/>
-        </w:rPr>
-        <w:t>不要用</w:t>
-      </w:r>
-      <w:r>
-        <w:rPr>
-          <w:rFonts w:hint="eastAsia"/>
-        </w:rPr>
-        <w:t>python</w:t>
-      </w:r>
-      <w:r>
-        <w:t>3.6</w:t>
-      </w:r>
-      <w:r>
-        <w:t xml:space="preserve">  </w:t>
-      </w:r>
-    </w:p>
-    <w:p>
-      <w:pPr>
-        <w:tabs>
-          <w:tab w:val="left" w:pos="2980"/>
-        </w:tabs>
-      </w:pPr>
-      <w:r>
-        <w:rPr>
-          <w:rFonts w:hint="eastAsia"/>
-        </w:rPr>
-        <w:t>命令</w:t>
-      </w:r>
-      <w:r>
-        <w:rPr>
-          <w:rFonts w:hint="eastAsia"/>
-        </w:rPr>
-        <w:t xml:space="preserve"> </w:t>
-      </w:r>
-      <w:r>
-        <w:t xml:space="preserve">: </w:t>
-      </w:r>
-      <w:r>
-        <w:t>python3 colorize.py ../data/</w:t>
-      </w:r>
-      <w:r>
-        <w:t xml:space="preserve"> </w:t>
-      </w:r>
-      <w:r>
-        <w:rPr>
-          <w:rFonts w:hint="eastAsia"/>
-        </w:rPr>
-        <w:t>即可</w:t>
-      </w:r>
-    </w:p>
-    <w:p>
-      <w:pPr>
-        <w:tabs>
-          <w:tab w:val="left" w:pos="2980"/>
-        </w:tabs>
-      </w:pPr>
-    </w:p>
-    <w:p>
-      <w:pPr>
-        <w:tabs>
-          <w:tab w:val="left" w:pos="2980"/>
-        </w:tabs>
-      </w:pPr>
-      <w:r>
-        <w:t xml:space="preserve">6. </w:t>
-      </w:r>
-      <w:r>
-        <w:t>AttributeError: 'NoneType' object has no attribute 'width'</w:t>
-      </w:r>
-    </w:p>
-    <w:p>
-      <w:pPr>
-        <w:tabs>
-          <w:tab w:val="left" w:pos="2980"/>
-        </w:tabs>
-      </w:pPr>
-      <w:r>
-        <w:rPr>
-          <w:rFonts w:hint="eastAsia"/>
-        </w:rPr>
-        <w:t>好像</w:t>
-      </w:r>
-      <w:r>
-        <w:rPr>
-          <w:rFonts w:hint="eastAsia"/>
-        </w:rPr>
-        <w:t>image</w:t>
-      </w:r>
-      <w:r>
-        <w:rPr>
-          <w:rFonts w:hint="eastAsia"/>
-        </w:rPr>
-        <w:t>没有读进来</w:t>
-      </w:r>
-    </w:p>
-    <w:p>
-      <w:pPr>
-        <w:tabs>
-          <w:tab w:val="left" w:pos="2980"/>
-        </w:tabs>
-      </w:pPr>
-      <w:r>
-        <w:rPr>
-          <w:rFonts w:hint="eastAsia"/>
-        </w:rPr>
-        <w:t>把图片改成一样大就可以了</w:t>
-      </w:r>
-      <w:r>
-        <w:rPr>
-          <w:rFonts w:hint="eastAsia"/>
-        </w:rPr>
-        <w:t>.</w:t>
-      </w:r>
-    </w:p>
-    <w:p>
-      <w:pPr>
-        <w:tabs>
-          <w:tab w:val="left" w:pos="2980"/>
-        </w:tabs>
-      </w:pPr>
-    </w:p>
-    <w:p>
-      <w:pPr>
-        <w:pStyle w:val="1"/>
-      </w:pPr>
-      <w:r>
-        <w:t>5</w:t>
-      </w:r>
-      <w:r>
-        <w:t xml:space="preserve"> </w:t>
-      </w:r>
-      <w:r>
-        <w:t>实验</w:t>
-      </w:r>
-      <w:r>
-        <w:rPr>
-          <w:rFonts w:hint="eastAsia"/>
-        </w:rPr>
-        <w:t>结果和分析</w:t>
-      </w:r>
-    </w:p>
-    <w:p>
-      <w:pPr>
-        <w:rPr>
-          <w:rFonts w:ascii="宋体" w:hAnsi="宋体"/>
-        </w:rPr>
-      </w:pPr>
-      <w:r>
-        <w:rPr>
-          <w:rFonts w:ascii="宋体" w:hAnsi="宋体" w:hint="eastAsia"/>
-        </w:rPr>
-        <w:t>（使用图片和文字叙述实验结果，并对这些结果进行适当分析）</w:t>
-      </w:r>
-    </w:p>
-    <w:p>
+        <w:rPr>
+          <w:rFonts w:hint="eastAsia"/>
+        </w:rPr>
+        <w:t>给出运行成功的证明截图</w:t>
+      </w:r>
+    </w:p>
+    <w:p>
+      <w:pPr>
+        <w:jc w:val="center"/>
+      </w:pPr>
       <w:r>
         <w:rPr>
           <w:noProof/>
         </w:rPr>
-        <w:lastRenderedPageBreak/>
         <w:drawing>
           <wp:inline distT="0" distB="0" distL="0" distR="0" wp14:anchorId="795A41BE" wp14:editId="16990BE3">
             <wp:extent cx="5274310" cy="1437640"/>
@@ -6728,6 +7173,7 @@
           <w:rFonts w:ascii="宋体" w:hAnsi="宋体"/>
         </w:rPr>
       </w:pPr>
+      <w:bookmarkStart w:id="0" w:name="_GoBack"/>
       <w:r>
         <w:rPr>
           <w:noProof/>
@@ -6768,6 +7214,7 @@
           </wp:inline>
         </w:drawing>
       </w:r>
+      <w:bookmarkEnd w:id="0"/>
     </w:p>
     <w:p>
       <w:pPr>
@@ -6942,8 +7389,8 @@
         </w:rPr>
         <w:drawing>
           <wp:inline distT="0" distB="0" distL="0" distR="0" wp14:anchorId="56B01C73" wp14:editId="6EF166BE">
-            <wp:extent cx="5274310" cy="1601470"/>
-            <wp:effectExtent l="0" t="0" r="2540" b="0"/>
+            <wp:extent cx="5813647" cy="1765232"/>
+            <wp:effectExtent l="0" t="0" r="0" b="6985"/>
             <wp:docPr id="12" name="图片 12"/>
             <wp:cNvGraphicFramePr>
               <a:graphicFrameLocks xmlns:a="http://schemas.openxmlformats.org/drawingml/2006/main" noChangeAspect="1"/>
@@ -6964,7 +7411,7 @@
                   <pic:spPr>
                     <a:xfrm>
                       <a:off x="0" y="0"/>
-                      <a:ext cx="5274310" cy="1601470"/>
+                      <a:ext cx="5820776" cy="1767397"/>
                     </a:xfrm>
                     <a:prstGeom prst="rect">
                       <a:avLst/>
@@ -7011,34 +7458,13 @@
       </w:pPr>
       <w:r>
         <w:rPr>
-          <w:rFonts w:ascii="宋体" w:hAnsi="宋体" w:hint="eastAsia"/>
-        </w:rPr>
-        <w:t>推理成功!</w:t>
-      </w:r>
-    </w:p>
-    <w:p>
-      <w:pPr>
-        <w:rPr>
-          <w:rFonts w:ascii="宋体" w:hAnsi="宋体"/>
-        </w:rPr>
-      </w:pPr>
-    </w:p>
-    <w:p>
-      <w:pPr>
-        <w:rPr>
-          <w:rFonts w:ascii="宋体" w:hAnsi="宋体"/>
-        </w:rPr>
-      </w:pPr>
-      <w:r>
-        <w:rPr>
           <w:rFonts w:ascii="宋体" w:hAnsi="宋体"/>
           <w:noProof/>
         </w:rPr>
-        <w:lastRenderedPageBreak/>
         <w:drawing>
           <wp:inline distT="0" distB="0" distL="0" distR="0">
-            <wp:extent cx="5274310" cy="3518953"/>
-            <wp:effectExtent l="0" t="0" r="2540" b="5715"/>
+            <wp:extent cx="4060284" cy="2708971"/>
+            <wp:effectExtent l="0" t="0" r="0" b="0"/>
             <wp:docPr id="13" name="图片 13" descr="C:\Users\12638\Desktop\out_dog.png"/>
             <wp:cNvGraphicFramePr>
               <a:graphicFrameLocks xmlns:a="http://schemas.openxmlformats.org/drawingml/2006/main" noChangeAspect="1"/>
@@ -7068,7 +7494,7 @@
                   <pic:spPr bwMode="auto">
                     <a:xfrm>
                       <a:off x="0" y="0"/>
-                      <a:ext cx="5274310" cy="3518953"/>
+                      <a:ext cx="4068191" cy="2714247"/>
                     </a:xfrm>
                     <a:prstGeom prst="rect">
                       <a:avLst/>
@@ -7091,10 +7517,25 @@
           <w:rFonts w:ascii="宋体" w:hAnsi="宋体"/>
         </w:rPr>
       </w:pPr>
-      <w:r>
-        <w:rPr>
-          <w:rFonts w:ascii="宋体" w:hAnsi="宋体" w:hint="eastAsia"/>
-        </w:rPr>
+    </w:p>
+    <w:p>
+      <w:pPr>
+        <w:rPr>
+          <w:rFonts w:ascii="宋体" w:hAnsi="宋体" w:hint="eastAsia"/>
+        </w:rPr>
+      </w:pPr>
+    </w:p>
+    <w:p>
+      <w:pPr>
+        <w:rPr>
+          <w:rFonts w:ascii="宋体" w:hAnsi="宋体"/>
+        </w:rPr>
+      </w:pPr>
+      <w:r>
+        <w:rPr>
+          <w:rFonts w:ascii="宋体" w:hAnsi="宋体" w:hint="eastAsia"/>
+        </w:rPr>
+        <w:lastRenderedPageBreak/>
         <w:t>原图</w:t>
       </w:r>
     </w:p>
@@ -7111,8 +7552,8 @@
         </w:rPr>
         <w:drawing>
           <wp:inline distT="0" distB="0" distL="0" distR="0">
-            <wp:extent cx="5274310" cy="3518953"/>
-            <wp:effectExtent l="0" t="0" r="2540" b="5715"/>
+            <wp:extent cx="4083017" cy="2724138"/>
+            <wp:effectExtent l="0" t="0" r="0" b="635"/>
             <wp:docPr id="14" name="图片 14" descr="C:\Users\12638\Desktop\dog.png"/>
             <wp:cNvGraphicFramePr>
               <a:graphicFrameLocks xmlns:a="http://schemas.openxmlformats.org/drawingml/2006/main" noChangeAspect="1"/>
@@ -7142,7 +7583,7 @@
                   <pic:spPr bwMode="auto">
                     <a:xfrm>
                       <a:off x="0" y="0"/>
-                      <a:ext cx="5274310" cy="3518953"/>
+                      <a:ext cx="4085129" cy="2725547"/>
                     </a:xfrm>
                     <a:prstGeom prst="rect">
                       <a:avLst/>
@@ -7177,7 +7618,6 @@
           <w:rFonts w:ascii="宋体" w:hAnsi="宋体"/>
           <w:noProof/>
         </w:rPr>
-        <w:lastRenderedPageBreak/>
         <w:drawing>
           <wp:inline distT="0" distB="0" distL="0" distR="0">
             <wp:extent cx="4581780" cy="2862794"/>
@@ -7252,6 +7692,7 @@
           <w:rFonts w:ascii="宋体" w:hAnsi="宋体"/>
           <w:noProof/>
         </w:rPr>
+        <w:lastRenderedPageBreak/>
         <w:drawing>
           <wp:inline distT="0" distB="0" distL="0" distR="0">
             <wp:extent cx="4395966" cy="2746694"/>
@@ -7333,7 +7774,6 @@
           <w:rFonts w:ascii="宋体" w:hAnsi="宋体"/>
           <w:noProof/>
         </w:rPr>
-        <w:lastRenderedPageBreak/>
         <w:drawing>
           <wp:inline distT="0" distB="0" distL="0" distR="0" wp14:anchorId="0FDB1FA0" wp14:editId="645900B5">
             <wp:extent cx="3543894" cy="3183285"/>
@@ -7387,6 +7827,7 @@
         <w:rPr>
           <w:noProof/>
         </w:rPr>
+        <w:lastRenderedPageBreak/>
         <w:drawing>
           <wp:inline distT="0" distB="0" distL="0" distR="0" wp14:anchorId="24D33E2B" wp14:editId="5704B463">
             <wp:extent cx="5274310" cy="2717165"/>
@@ -7528,7 +7969,6 @@
           <w:rFonts w:ascii="宋体" w:hAnsi="宋体"/>
           <w:noProof/>
         </w:rPr>
-        <w:lastRenderedPageBreak/>
         <w:drawing>
           <wp:inline distT="0" distB="0" distL="0" distR="0">
             <wp:extent cx="5274310" cy="4737622"/>
@@ -7641,6 +8081,7 @@
           <w:rFonts w:ascii="宋体" w:hAnsi="宋体"/>
           <w:noProof/>
         </w:rPr>
+        <w:lastRenderedPageBreak/>
         <w:drawing>
           <wp:inline distT="0" distB="0" distL="0" distR="0" wp14:anchorId="019E04A4" wp14:editId="2624B955">
             <wp:extent cx="2966856" cy="2664963"/>
@@ -7714,7 +8155,6 @@
         <w:rPr>
           <w:noProof/>
         </w:rPr>
-        <w:lastRenderedPageBreak/>
         <w:drawing>
           <wp:inline distT="0" distB="0" distL="0" distR="0" wp14:anchorId="18B76AD7" wp14:editId="4F8A8927">
             <wp:extent cx="5274310" cy="1021715"/>
@@ -7884,10 +8324,178 @@
     </w:p>
     <w:p>
       <w:pPr>
-        <w:rPr>
-          <w:rFonts w:ascii="宋体" w:hAnsi="宋体"/>
-        </w:rPr>
-      </w:pPr>
+        <w:pStyle w:val="2"/>
+      </w:pPr>
+      <w:r>
+        <w:rPr>
+          <w:rFonts w:hint="eastAsia"/>
+        </w:rPr>
+        <w:t>5</w:t>
+      </w:r>
+      <w:r>
+        <w:t>.2</w:t>
+      </w:r>
+      <w:r>
+        <w:rPr>
+          <w:rFonts w:hint="eastAsia"/>
+        </w:rPr>
+        <w:t>个人收获</w:t>
+      </w:r>
+    </w:p>
+    <w:p>
+      <w:pPr>
+        <w:rPr>
+          <w:rFonts w:hint="eastAsia"/>
+        </w:rPr>
+      </w:pPr>
+      <w:r>
+        <w:rPr>
+          <w:rFonts w:hint="eastAsia"/>
+        </w:rPr>
+        <w:t>这次对我的收获是非常大的</w:t>
+      </w:r>
+      <w:r>
+        <w:rPr>
+          <w:rFonts w:hint="eastAsia"/>
+        </w:rPr>
+        <w:t>,</w:t>
+      </w:r>
+      <w:r>
+        <w:t xml:space="preserve"> </w:t>
+      </w:r>
+      <w:r>
+        <w:rPr>
+          <w:rFonts w:hint="eastAsia"/>
+        </w:rPr>
+        <w:t>首先是对环境变量有了深入的认识</w:t>
+      </w:r>
+      <w:r>
+        <w:rPr>
+          <w:rFonts w:hint="eastAsia"/>
+        </w:rPr>
+        <w:t>,</w:t>
+      </w:r>
+      <w:r>
+        <w:t xml:space="preserve"> </w:t>
+      </w:r>
+      <w:r>
+        <w:rPr>
+          <w:rFonts w:hint="eastAsia"/>
+        </w:rPr>
+        <w:t>花了两天时间认识了各种环境变量的错误</w:t>
+      </w:r>
+      <w:r>
+        <w:rPr>
+          <w:rFonts w:hint="eastAsia"/>
+        </w:rPr>
+        <w:t>,</w:t>
+      </w:r>
+      <w:r>
+        <w:t xml:space="preserve"> </w:t>
+      </w:r>
+      <w:r>
+        <w:rPr>
+          <w:rFonts w:hint="eastAsia"/>
+        </w:rPr>
+        <w:t>这次实验后我就很快可以指出其他人遇到的问题可能是什么原因</w:t>
+      </w:r>
+      <w:r>
+        <w:rPr>
+          <w:rFonts w:hint="eastAsia"/>
+        </w:rPr>
+        <w:t>.</w:t>
+      </w:r>
+      <w:r>
+        <w:t xml:space="preserve"> </w:t>
+      </w:r>
+      <w:r>
+        <w:rPr>
+          <w:rFonts w:hint="eastAsia"/>
+        </w:rPr>
+        <w:t>基本上大部分错误都是因为环境变量没有设置好</w:t>
+      </w:r>
+      <w:r>
+        <w:t xml:space="preserve">. </w:t>
+      </w:r>
+      <w:r>
+        <w:rPr>
+          <w:rFonts w:hint="eastAsia"/>
+        </w:rPr>
+        <w:t>还有就是万事开头难</w:t>
+      </w:r>
+      <w:r>
+        <w:rPr>
+          <w:rFonts w:hint="eastAsia"/>
+        </w:rPr>
+        <w:t>,</w:t>
+      </w:r>
+      <w:r>
+        <w:t xml:space="preserve"> </w:t>
+      </w:r>
+      <w:r>
+        <w:rPr>
+          <w:rFonts w:hint="eastAsia"/>
+        </w:rPr>
+        <w:t>一开始的一个小错误可能会导致后面越来越错</w:t>
+      </w:r>
+      <w:r>
+        <w:rPr>
+          <w:rFonts w:hint="eastAsia"/>
+        </w:rPr>
+        <w:t>,</w:t>
+      </w:r>
+      <w:r>
+        <w:t xml:space="preserve"> </w:t>
+      </w:r>
+      <w:r>
+        <w:rPr>
+          <w:rFonts w:hint="eastAsia"/>
+        </w:rPr>
+        <w:t>所以在面对一个大项目的时候</w:t>
+      </w:r>
+      <w:r>
+        <w:rPr>
+          <w:rFonts w:hint="eastAsia"/>
+        </w:rPr>
+        <w:t>,</w:t>
+      </w:r>
+      <w:r>
+        <w:t xml:space="preserve"> </w:t>
+      </w:r>
+      <w:r>
+        <w:rPr>
+          <w:rFonts w:hint="eastAsia"/>
+        </w:rPr>
+        <w:t>很多错误很可能不是这里的问题</w:t>
+      </w:r>
+      <w:r>
+        <w:rPr>
+          <w:rFonts w:hint="eastAsia"/>
+        </w:rPr>
+        <w:t>,</w:t>
+      </w:r>
+      <w:r>
+        <w:t xml:space="preserve"> </w:t>
+      </w:r>
+      <w:r>
+        <w:rPr>
+          <w:rFonts w:hint="eastAsia"/>
+        </w:rPr>
+        <w:t>而</w:t>
+      </w:r>
+      <w:r>
+        <w:rPr>
+          <w:rFonts w:hint="eastAsia"/>
+        </w:rPr>
+        <w:lastRenderedPageBreak/>
+        <w:t>是一开始配置的问题</w:t>
+      </w:r>
+      <w:r>
+        <w:rPr>
+          <w:rFonts w:hint="eastAsia"/>
+        </w:rPr>
+        <w:t>.</w:t>
+      </w:r>
     </w:p>
     <w:sectPr>
       <w:pgSz w:w="11906" w:h="16838"/>

</xml_diff>